<commit_message>
Refactor slide processing logic: - Removed deprecated input_processor module and replaced it with initialize_and_provider for improved chunk handling. - Enhanced slide creation logic to intelligently split long sections into multiple slides based on character limits. - Updated main.py to reflect new node names and adjusted workflow edges accordingly. - Improved HTML rendering and slide evaluation prompts for better clarity and consistency. - Deleted unused temporary PDF file and updated test cases to validate new functionality.
</commit_message>
<xml_diff>
--- a/test_input/sample.docx
+++ b/test_input/sample.docx
@@ -48,12 +48,17 @@
         <w:pStyle w:val="Heading1"/>
       </w:pPr>
       <w:r>
-        <w:t>Slide 3: Một ví dụ về nội dung dài</w:t>
+        <w:t>Slide 3: Ví dụ về nội dung dài</w:t>
       </w:r>
     </w:p>
     <w:p>
       <w:r>
-        <w:t>Nội dung này được thiết kế để rất dài và có thể không vừa một slide duy nhất. Nó buộc LLM phải sử dụng khả năng chia tách nội dung của mình. Đây là dòng 1. Đây là dòng 2. Đây là dòng 3. Đây là dòng 4. Đây là dòng 5. Đây là dòng 6. Đây là dòng 7. Đây là dòng 8. Đây là dòng 9. Đây là dòng 10. LLM nên nhận ra điều này và đặt phần còn lại vào `remaining_content`.</w:t>
+        <w:t>Phần đầu tiên của nội dung này đủ ngắn để vừa vặn. Nó giới thiệu khái niệm và thiết lập bối cảnh. Chúng ta sẽ thảo luận về các nguyên tắc cơ bản và lý do tại sao phương pháp này lại hiệu quả. Đoạn này bao gồm một vài câu để đảm bảo nó có nội dung đáng kể, nhưng không quá dài đến mức tự nó vượt quá giới hạn.</w:t>
+      </w:r>
+    </w:p>
+    <w:p>
+      <w:r>
+        <w:t>Bây giờ, phần thứ hai này là phần đẩy nội dung vượt quá giới hạn 600 ký tự. Bằng cách thêm đoạn văn này, tổng độ dài của 'Slide 3' sẽ yêu cầu logic phân tách phải được kích hoạt. Trình xử lý thông minh sẽ giữ 'Phần đầu tiên' trên một slide và đặt 'Phần thứ hai' này trên một slide mới, nhưng cả hai đều có cùng một tiêu đề 'Slide 3'.</w:t>
       </w:r>
     </w:p>
     <w:sectPr>

</xml_diff>